<commit_message>
Sync handover doc: 人事架構調整 + 拿掉已完成的 backlog
Becca 在 Word 改了第六節「現任成員結構」:
- NULLA0011 樊奕君 Becca: 主管 → 一般員工
- NULLA0003 李昆達: 一般員工 → 主管
- NULLA0006 小嫚: 會計 → 超級管理員

也順手拿掉第七節 backlog 第 2 條「管理者身分變更通知」— 今天
已實作上線(spec §9.1)。

md 跟著她的 docx 更新,docx 重產一次保留她的內容改動 + 我的格式
(用 scripts/md-to-docx.mjs 重產,失去她在 Word 的格式微調,但她
似乎只改了文字內容)。

Co-Authored-By: Claude Opus 4.7 (1M context) <noreply@anthropic.com>
</commit_message>
<xml_diff>
--- a/docs/移交清單.docx
+++ b/docs/移交清單.docx
@@ -58,7 +58,7 @@
       <w:pPr>
         <w:spacing w:after="120"/>
       </w:pPr>
-      <w:hyperlink w:history="1" r:id="rIdg73xujwkbo3o2qfr5v_qh">
+      <w:hyperlink w:history="1" r:id="rId0119ke4yj_iexyxc65v5l">
         <w:r>
           <w:rPr>
             <w:rFonts w:ascii="Microsoft JhengHei" w:cs="Microsoft JhengHei" w:eastAsia="Microsoft JhengHei" w:hAnsi="Microsoft JhengHei"/>
@@ -642,7 +642,7 @@
             </w:tcMar>
           </w:tcPr>
           <w:p>
-            <w:hyperlink w:history="1" r:id="rIdkj2t5w8xdmoy6raberaij">
+            <w:hyperlink w:history="1" r:id="rIdegsrotc-1xois_xhgteem">
               <w:r>
                 <w:rPr>
                   <w:rFonts w:ascii="Microsoft JhengHei" w:cs="Microsoft JhengHei" w:eastAsia="Microsoft JhengHei" w:hAnsi="Microsoft JhengHei"/>
@@ -753,7 +753,7 @@
             </w:tcMar>
           </w:tcPr>
           <w:p>
-            <w:hyperlink w:history="1" r:id="rIdluavekdwkdjtrux7yrkio">
+            <w:hyperlink w:history="1" r:id="rIdcarsplvehwts-tqqppmxj">
               <w:r>
                 <w:rPr>
                   <w:rFonts w:ascii="Microsoft JhengHei" w:cs="Microsoft JhengHei" w:eastAsia="Microsoft JhengHei" w:hAnsi="Microsoft JhengHei"/>
@@ -849,7 +849,7 @@
             </w:tcMar>
           </w:tcPr>
           <w:p>
-            <w:hyperlink w:history="1" r:id="rIdsyipfhtyzkatffdhotmiq">
+            <w:hyperlink w:history="1" r:id="rIddxswfrt7sl5ngok3kt84a">
               <w:r>
                 <w:rPr>
                   <w:rFonts w:ascii="Microsoft JhengHei" w:cs="Microsoft JhengHei" w:eastAsia="Microsoft JhengHei" w:hAnsi="Microsoft JhengHei"/>
@@ -930,7 +930,7 @@
             </w:tcMar>
           </w:tcPr>
           <w:p>
-            <w:hyperlink w:history="1" r:id="rIdscaniit4q2zs6mjcubxdg">
+            <w:hyperlink w:history="1" r:id="rIdps-cpc3u1povrzo6uklrh">
               <w:r>
                 <w:rPr>
                   <w:rFonts w:ascii="Microsoft JhengHei" w:cs="Microsoft JhengHei" w:eastAsia="Microsoft JhengHei" w:hAnsi="Microsoft JhengHei"/>
@@ -1944,7 +1944,7 @@
         </w:rPr>
         <w:t xml:space="preserve">先看 Vercel:</w:t>
       </w:r>
-      <w:hyperlink w:history="1" r:id="rIdy4yr2jkzfr3stu_2d_-9b">
+      <w:hyperlink w:history="1" r:id="rIdv6oxektuhj1zedwxsx1vb">
         <w:r>
           <w:rPr>
             <w:rFonts w:ascii="Microsoft JhengHei" w:cs="Microsoft JhengHei" w:eastAsia="Microsoft JhengHei" w:hAnsi="Microsoft JhengHei"/>
@@ -2033,7 +2033,7 @@
         </w:rPr>
         <w:t xml:space="preserve">看 Supabase:</w:t>
       </w:r>
-      <w:hyperlink w:history="1" r:id="rIdh3and2byohtz4g3xjucrx">
+      <w:hyperlink w:history="1" r:id="rIdrexhbumfayw-uiq9wct4k">
         <w:r>
           <w:rPr>
             <w:rFonts w:ascii="Microsoft JhengHei" w:cs="Microsoft JhengHei" w:eastAsia="Microsoft JhengHei" w:hAnsi="Microsoft JhengHei"/>
@@ -5191,7 +5191,7 @@
               <w:rPr>
                 <w:rFonts w:ascii="Microsoft JhengHei" w:cs="Microsoft JhengHei" w:eastAsia="Microsoft JhengHei" w:hAnsi="Microsoft JhengHei"/>
               </w:rPr>
-              <w:t xml:space="preserve">主管</w:t>
+              <w:t xml:space="preserve">一般員工</w:t>
             </w:r>
           </w:p>
         </w:tc>
@@ -5572,7 +5572,7 @@
               <w:rPr>
                 <w:rFonts w:ascii="Microsoft JhengHei" w:cs="Microsoft JhengHei" w:eastAsia="Microsoft JhengHei" w:hAnsi="Microsoft JhengHei"/>
               </w:rPr>
-              <w:t xml:space="preserve">一般員工</w:t>
+              <w:t xml:space="preserve">主管</w:t>
             </w:r>
           </w:p>
         </w:tc>
@@ -5978,7 +5978,7 @@
               <w:rPr>
                 <w:rFonts w:ascii="Microsoft JhengHei" w:cs="Microsoft JhengHei" w:eastAsia="Microsoft JhengHei" w:hAnsi="Microsoft JhengHei"/>
               </w:rPr>
-              <w:t xml:space="preserve">會計</w:t>
+              <w:t xml:space="preserve">超級管理員</w:t>
             </w:r>
           </w:p>
         </w:tc>
@@ -6081,29 +6081,6 @@
           <w:rFonts w:ascii="Microsoft JhengHei" w:cs="Microsoft JhengHei" w:eastAsia="Microsoft JhengHei" w:hAnsi="Microsoft JhengHei"/>
         </w:rPr>
         <w:t xml:space="preserve">(規格 §2.3 / §8.6)— 目前系統設計上支援多公司,但 UI 只給 NULLA。如果診所 1 / 2 要上線,要做「右上角切換單位」按鈕。估 2-3 小時。</w:t>
-      </w:r>
-    </w:p>
-    <w:p>
-      <w:pPr>
-        <w:pStyle w:val="ListParagraph"/>
-        <w:numPr>
-          <w:ilvl w:val="0"/>
-          <w:numId w:val="3"/>
-        </w:numPr>
-      </w:pPr>
-      <w:r>
-        <w:rPr>
-          <w:rFonts w:ascii="Microsoft JhengHei" w:cs="Microsoft JhengHei" w:eastAsia="Microsoft JhengHei" w:hAnsi="Microsoft JhengHei"/>
-          <w:b/>
-          <w:bCs/>
-        </w:rPr>
-        <w:t xml:space="preserve">管理者身分變更通知</w:t>
-      </w:r>
-      <w:r>
-        <w:rPr>
-          <w:rFonts w:ascii="Microsoft JhengHei" w:cs="Microsoft JhengHei" w:eastAsia="Microsoft JhengHei" w:hAnsi="Microsoft JhengHei"/>
-        </w:rPr>
-        <w:t xml:space="preserve">(規格 §9.1)— 改別人權限時自動寄 email 通知超管 + 會計。目前只有解鎖 / 解綁有寄 audit email,角色變更還沒做。</w:t>
       </w:r>
     </w:p>
     <w:p>

</xml_diff>

<commit_message>
Revert Becca's 職位 in 移交清單 back to 主管
Becca had toyed with the idea of stepping down to 一般員工 in the docx
edit, but kept her actual DB role as 主管 — so the docx revert
restores parity with /admin/employees (Eric/Ellie's 直屬主管 stays as
Becca, since she didn't actually delegate evaluation to 李昆達).

李昆達 stays as 主管 (no direct reports) and 小嫚 stays as 超管 — both
match the DB.

Co-Authored-By: Claude Opus 4.7 (1M context) <noreply@anthropic.com>
</commit_message>
<xml_diff>
--- a/docs/移交清單.docx
+++ b/docs/移交清單.docx
@@ -58,7 +58,7 @@
       <w:pPr>
         <w:spacing w:after="120"/>
       </w:pPr>
-      <w:hyperlink w:history="1" r:id="rId0119ke4yj_iexyxc65v5l">
+      <w:hyperlink w:history="1" r:id="rIdwmtnmievemdou7tmdc_70">
         <w:r>
           <w:rPr>
             <w:rFonts w:ascii="Microsoft JhengHei" w:cs="Microsoft JhengHei" w:eastAsia="Microsoft JhengHei" w:hAnsi="Microsoft JhengHei"/>
@@ -642,7 +642,7 @@
             </w:tcMar>
           </w:tcPr>
           <w:p>
-            <w:hyperlink w:history="1" r:id="rIdegsrotc-1xois_xhgteem">
+            <w:hyperlink w:history="1" r:id="rIdyl_e82rbhysbi5i12x4t1">
               <w:r>
                 <w:rPr>
                   <w:rFonts w:ascii="Microsoft JhengHei" w:cs="Microsoft JhengHei" w:eastAsia="Microsoft JhengHei" w:hAnsi="Microsoft JhengHei"/>
@@ -753,7 +753,7 @@
             </w:tcMar>
           </w:tcPr>
           <w:p>
-            <w:hyperlink w:history="1" r:id="rIdcarsplvehwts-tqqppmxj">
+            <w:hyperlink w:history="1" r:id="rIdngh42mlq1ajnrjobwo_h7">
               <w:r>
                 <w:rPr>
                   <w:rFonts w:ascii="Microsoft JhengHei" w:cs="Microsoft JhengHei" w:eastAsia="Microsoft JhengHei" w:hAnsi="Microsoft JhengHei"/>
@@ -849,7 +849,7 @@
             </w:tcMar>
           </w:tcPr>
           <w:p>
-            <w:hyperlink w:history="1" r:id="rIddxswfrt7sl5ngok3kt84a">
+            <w:hyperlink w:history="1" r:id="rIdljbus3z5ljils_ejwprlk">
               <w:r>
                 <w:rPr>
                   <w:rFonts w:ascii="Microsoft JhengHei" w:cs="Microsoft JhengHei" w:eastAsia="Microsoft JhengHei" w:hAnsi="Microsoft JhengHei"/>
@@ -930,7 +930,7 @@
             </w:tcMar>
           </w:tcPr>
           <w:p>
-            <w:hyperlink w:history="1" r:id="rIdps-cpc3u1povrzo6uklrh">
+            <w:hyperlink w:history="1" r:id="rIdb5fue_wsh6f5cfpu_nwob">
               <w:r>
                 <w:rPr>
                   <w:rFonts w:ascii="Microsoft JhengHei" w:cs="Microsoft JhengHei" w:eastAsia="Microsoft JhengHei" w:hAnsi="Microsoft JhengHei"/>
@@ -1944,7 +1944,7 @@
         </w:rPr>
         <w:t xml:space="preserve">先看 Vercel:</w:t>
       </w:r>
-      <w:hyperlink w:history="1" r:id="rIdv6oxektuhj1zedwxsx1vb">
+      <w:hyperlink w:history="1" r:id="rIdi4sizet7pgjf5qfy2vwql">
         <w:r>
           <w:rPr>
             <w:rFonts w:ascii="Microsoft JhengHei" w:cs="Microsoft JhengHei" w:eastAsia="Microsoft JhengHei" w:hAnsi="Microsoft JhengHei"/>
@@ -2033,7 +2033,7 @@
         </w:rPr>
         <w:t xml:space="preserve">看 Supabase:</w:t>
       </w:r>
-      <w:hyperlink w:history="1" r:id="rIdrexhbumfayw-uiq9wct4k">
+      <w:hyperlink w:history="1" r:id="rIdu6ioffzqvsli4mxhuz0tr">
         <w:r>
           <w:rPr>
             <w:rFonts w:ascii="Microsoft JhengHei" w:cs="Microsoft JhengHei" w:eastAsia="Microsoft JhengHei" w:hAnsi="Microsoft JhengHei"/>
@@ -5191,7 +5191,7 @@
               <w:rPr>
                 <w:rFonts w:ascii="Microsoft JhengHei" w:cs="Microsoft JhengHei" w:eastAsia="Microsoft JhengHei" w:hAnsi="Microsoft JhengHei"/>
               </w:rPr>
-              <w:t xml:space="preserve">一般員工</w:t>
+              <w:t xml:space="preserve">主管</w:t>
             </w:r>
           </w:p>
         </w:tc>

</xml_diff>